<commit_message>
Spell out every identifier
ACC-1001 is now ACCOUNT-1001, TCK-004417 is TICKET-004417, PRP-000301 is
PROPOSAL-000301, KB-0117 is ARTICLE-0117, and the same for POLICY, INCIDENT,
ESCALATION, REQUEST, ISSUE, OPPORTUNITY, DECISION, EXPERIMENT and BLOCKER.

Person codes are gone entirely. P-LUC is Lucia Ferreira. A name reads better
than a code that has to be looked up, and the code bought nothing.

Word documents and spreadsheets were rewritten at the zip level rather than
through openpyxl or python-docx, so the reporting pack's stale cached value
survived. It was the point of that fixture and a library round-trip would have
destroyed it.

Two things the bulk rename missed and the tests caught: the OpenAPI contract's
regex patterns, where the prefix is followed by a character class rather than a
digit, and two f-strings that generate proposal identifiers at runtime.
</commit_message>
<xml_diff>
--- a/docs/interviews/2026-08-14 Lucia Ferreira, how the packs get made.docx
+++ b/docs/interviews/2026-08-14 Lucia Ferreira, how the packs get made.docx
@@ -12,7 +12,7 @@
     </w:p>
     <w:p>
       <w:r>
-        <w:t>Who: Lucia Ferreira (P-LUC), Service Delivery Manager. She has made every pack for the</w:t>
+        <w:t>Who: Lucia Ferreira (Lucia Ferreira), Service Delivery Manager. She has made every pack for the</w:t>
       </w:r>
     </w:p>
     <w:p>
@@ -22,7 +22,7 @@
     </w:p>
     <w:p>
       <w:r>
-        <w:t>Interviewer: Mei Tan (P-MEI), Head of Engineering.</w:t>
+        <w:t>Interviewer: Mei Tan (Mei Tan), Head of Engineering.</w:t>
       </w:r>
     </w:p>
     <w:p>
@@ -421,7 +421,7 @@
         <w:pStyle w:val="ListNumber"/>
       </w:pPr>
       <w:r>
-        <w:t>POL-14 requires a second reader. She has never heard of it and there is nowhere to record</w:t>
+        <w:t>POLICY-14 requires a second reader. She has never heard of it and there is nowhere to record</w:t>
       </w:r>
     </w:p>
     <w:p>
@@ -434,7 +434,7 @@
         <w:pStyle w:val="ListNumber"/>
       </w:pPr>
       <w:r>
-        <w:t>The August definition change is INC-03 in the analytics repository. She has the consumer</w:t>
+        <w:t>The August definition change is INCIDENT-03 in the analytics repository. She has the consumer</w:t>
       </w:r>
     </w:p>
     <w:p>

</xml_diff>

<commit_message>
Interviewer notes ask questions rather than state findings
Each interview ended with a note enumerating the seeded defects, cross-referenced
across repositories. A real interviewer jots something down; they do not produce
a numbered list of everything wrong with the company.

The notes are now what Mei would actually write after the conversation: who to
ask next, and what she was not sure about. The evidence is still in the
transcript, so the findings remain reachable. Lucia still says of the
percentages, 'Not that I have noticed. Why, should I have?'

Also removes a duplication the identifier rename introduced, where 'Lucia
Ferreira (P-LUC)' became 'Lucia Ferreira (Lucia Ferreira)'.
</commit_message>
<xml_diff>
--- a/docs/interviews/2026-08-14 Lucia Ferreira, how the packs get made.docx
+++ b/docs/interviews/2026-08-14 Lucia Ferreira, how the packs get made.docx
@@ -12,7 +12,7 @@
     </w:p>
     <w:p>
       <w:r>
-        <w:t>Who: Lucia Ferreira (Lucia Ferreira), Service Delivery Manager. She has made every pack for the</w:t>
+        <w:t>Who: Lucia Ferreira, Service Delivery Manager. She has made every pack for the</w:t>
       </w:r>
     </w:p>
     <w:p>
@@ -22,7 +22,7 @@
     </w:p>
     <w:p>
       <w:r>
-        <w:t>Interviewer: Mei Tan (Mei Tan), Head of Engineering.</w:t>
+        <w:t>Interviewer: Mei Tan, Head of Engineering.</w:t>
       </w:r>
     </w:p>
     <w:p>
@@ -400,51 +400,22 @@
     </w:p>
     <w:p>
       <w:r>
-        <w:t>Three things worth recording separately.</w:t>
-      </w:r>
-    </w:p>
-    <w:p>
-      <w:pPr>
-        <w:pStyle w:val="ListNumber"/>
-      </w:pPr>
-      <w:r>
-        <w:t>She does not know whether the percentages have ever failed to recalculate, and there is no</w:t>
+        <w:t>Things to follow up.</w:t>
       </w:r>
     </w:p>
     <w:p>
       <w:r>
-        <w:t xml:space="preserve">   way for her to find out. That is worth checking.</w:t>
-      </w:r>
-    </w:p>
-    <w:p>
-      <w:pPr>
-        <w:pStyle w:val="ListNumber"/>
-      </w:pPr>
-      <w:r>
-        <w:t>POLICY-14 requires a second reader. She has never heard of it and there is nowhere to record</w:t>
+        <w:t>Can she tell whether a percentage has ever failed to recalculate? She did not seem sure either way.</w:t>
       </w:r>
     </w:p>
     <w:p>
       <w:r>
-        <w:t xml:space="preserve">   compliance, so it has been unenforceable since it was written.</w:t>
-      </w:r>
-    </w:p>
-    <w:p>
-      <w:pPr>
-        <w:pStyle w:val="ListNumber"/>
-      </w:pPr>
-      <w:r>
-        <w:t>The August definition change is INCIDENT-03 in the analytics repository. She has the consumer</w:t>
+        <w:t>Ask Gabriela about POLICY-14. Lucia had not heard of it.</w:t>
       </w:r>
     </w:p>
     <w:p>
       <w:r>
-        <w:t xml:space="preserve">   side of it and Declan has the producer side. Neither of them has the whole picture, and the</w:t>
-      </w:r>
-    </w:p>
-    <w:p>
-      <w:r>
-        <w:t xml:space="preserve">   thing that would have prevented it (a list of consumers per metric) belongs to neither.</w:t>
+        <w:t>Worth talking to Declan about the August definition change. Lucia only saw her end of it.</w:t>
       </w:r>
     </w:p>
     <w:sectPr>

</xml_diff>